<commit_message>
Adım 3 tamam: açık küme analizi, kırılımlar, Rapor 3
- evaluation/open_set.py: abs/margin skorları, AUROC, kapsama–kesinlik, τ seçimi/uygulama
- evaluation/breakdown.py: occlusion/scale/zoom_in/viewpoint/kategori R@K kırılımı
- evaluator: openset + breakdown + auroc_correct (seçici tahmin); evaluate.py τ'yu val_internal'dan alır
- tests/test_open_set.py (4 test, toplam 13); figures: hist_overlay, lines; legend konumu
- scripts/report_03_openset.py → docs/reports/03_acik_kume_ve_kirilimlar.docx
- EXPERIMENTS AUROC sütunu dolduruldu; DECISIONS/STATUS güncel

Co-Authored-By: Claude Fable 5.1 <noreply@anthropic.com>
</commit_message>
<xml_diff>
--- a/docs/reports/02_omurga_karsilastirmasi.docx
+++ b/docs/reports/02_omurga_karsilastirmasi.docx
@@ -681,7 +681,7 @@
           </w:tcPr>
           <w:p>
             <w:r>
-              <w:t>0,283</w:t>
+              <w:t>0,208</w:t>
             </w:r>
           </w:p>
         </w:tc>
@@ -773,7 +773,7 @@
           </w:tcPr>
           <w:p>
             <w:r>
-              <w:t>0,670</w:t>
+              <w:t>0,594</w:t>
             </w:r>
           </w:p>
         </w:tc>
@@ -865,7 +865,7 @@
           </w:tcPr>
           <w:p>
             <w:r>
-              <w:t>0,286</w:t>
+              <w:t>0,159</w:t>
             </w:r>
           </w:p>
         </w:tc>
@@ -957,7 +957,7 @@
           </w:tcPr>
           <w:p>
             <w:r>
-              <w:t>0,270</w:t>
+              <w:t>0,210</w:t>
             </w:r>
           </w:p>
         </w:tc>
@@ -971,7 +971,7 @@
       <w:r>
         <w:drawing>
           <wp:inline xmlns:a="http://schemas.openxmlformats.org/drawingml/2006/main" xmlns:pic="http://schemas.openxmlformats.org/drawingml/2006/picture">
-            <wp:extent cx="5486400" cy="3482588"/>
+            <wp:extent cx="5486400" cy="3771599"/>
             <wp:docPr id="2" name="Picture 2"/>
             <wp:cNvGraphicFramePr>
               <a:graphicFrameLocks noChangeAspect="1"/>
@@ -992,7 +992,7 @@
                   <pic:spPr>
                     <a:xfrm>
                       <a:off x="0" y="0"/>
-                      <a:ext cx="5486400" cy="3482588"/>
+                      <a:ext cx="5486400" cy="3771599"/>
                     </a:xfrm>
                     <a:prstGeom prst="rect"/>
                   </pic:spPr>

</xml_diff>

<commit_message>
Raporlar baştan yazıldı: veri seti, işlemler ve yöntemler öğretici biçimde
- Rapor 1: pair_id/style/koşul/kategori örnek şekilleri, gerçek JSON, kırpma aritmetiği, her işlemin amacı/sonucu
- Rapor 2: gömme, kosinüs (sayısal örnek), FAISS, ResNet/ViT/CLIP/SigLIP/DINOv2 mekanizmaları, metrik örnekleri
- Rapor 3: s1/s2 gerçek sorgu örnekleri, AUROC ve kapsama–kesinlik el hesabı, τ seçimi, strict açık küme varyantı
- evaluator: auroc_*_strict (aynı pair_id'li galeri dışlanır), openset_top1_same_pair_id
- figures: image_grid, patch_grid; docx_report: h3, mono, definition
- 01 raporu Word'de açık olduğu için bu commit'te eski sürümü; betik hazır

Co-Authored-By: Claude Fable 5.1 <noreply@anthropic.com>
</commit_message>
<xml_diff>
--- a/docs/reports/02_omurga_karsilastirmasi.docx
+++ b/docs/reports/02_omurga_karsilastirmasi.docx
@@ -31,7 +31,7 @@
         <w:rPr>
           <w:i/>
         </w:rPr>
-        <w:t>Dört hazır modelin müşteri→mağaza ürün eşleştirmesinde ham başarısı (Tablo 1)</w:t>
+        <w:t>Görüntüden vektöre: dört hazır model nasıl çalışır, başarı nasıl ölçülür, hangisi en iyi (Tablo 1)</w:t>
       </w:r>
     </w:p>
     <w:p>
@@ -42,7 +42,7 @@
         <w:rPr>
           <w:sz w:val="20"/>
         </w:rPr>
-        <w:t>Ethem Belka Şahin · 19.10.2026</w:t>
+        <w:t>Ethem Belka Şahin · 21.10.2026</w:t>
       </w:r>
     </w:p>
     <w:p>
@@ -50,273 +50,12 @@
         <w:pStyle w:val="Heading1"/>
       </w:pPr>
       <w:r>
-        <w:t>1. Bu rapor ne anlatıyor?</w:t>
+        <w:t>1. Bu adımın sorusu</w:t>
       </w:r>
     </w:p>
     <w:p>
       <w:r>
-        <w:t>Adım 1'de her kıyafet küçük bir resim (kırpıntı) hâline getirilmişti. Bu adımda dört hazır yapay zekâ modeli, hiç eğitilmeden, her kırpıntıyı bir sayı dizisine (vektöre) çevirdi; sonra her müşteri fotoğrafı için mağaza kataloğundaki en benzer vektörler bulundu. Soru şu: hangi hazır model, hiçbir ek eğitim olmadan, aynı ürünü en iyi buluyor? Proje önerisindeki Araştırma Sorusu 1 budur.</w:t>
-      </w:r>
-    </w:p>
-    <w:p>
-      <w:r>
-        <w:rPr>
-          <w:i/>
-          <w:color w:val="404040"/>
-        </w:rPr>
-        <w:t>Vektör ne demek? Model, bir resme bakıp onu örneğin 768 sayıyla özetler. Benzer görünen resimlerin sayıları birbirine yakın olur. 'Benzerlik' bu iki sayı dizisi arasındaki açının kosinüsüdür (1 = aynı, 0 = ilgisiz).</w:t>
-      </w:r>
-    </w:p>
-    <w:p>
-      <w:pPr>
-        <w:pStyle w:val="Heading1"/>
-      </w:pPr>
-      <w:r>
-        <w:t>2. Başlangıç noktası ve taahhüt</w:t>
-      </w:r>
-    </w:p>
-    <w:p>
-      <w:r>
-        <w:t>Elimizde Adım 1'den gelen listeler vardı:</w:t>
-      </w:r>
-    </w:p>
-    <w:p>
-      <w:pPr>
-        <w:pStyle w:val="ListBullet"/>
-      </w:pPr>
-      <w:r>
-        <w:t>Test galerisi: 36.958 mağaza görüntüsü (resmi val_gallery.json).</w:t>
-      </w:r>
-    </w:p>
-    <w:p>
-      <w:pPr>
-        <w:pStyle w:val="ListBullet"/>
-      </w:pPr>
-      <w:r>
-        <w:t>Test sorguları: 12.375 müşteri görüntüsü (resmi val_query.json).</w:t>
-      </w:r>
-    </w:p>
-    <w:p>
-      <w:pPr>
-        <w:pStyle w:val="ListBullet"/>
-      </w:pPr>
-      <w:r>
-        <w:t>val_internal: eğitim verisinden ayrılmış 14.533 galeri / 6.236 sorgu; model seçimi burada yapılır.</w:t>
-      </w:r>
-    </w:p>
-    <w:p>
-      <w:r>
-        <w:t>Öneride verilen söz: ResNet-50, CLIP ViT-B/16, SigLIP ViT-B/16 ve DINOv2 ViT-B/14 modelleri dondurulmuş hâlde, L2-normalize edilmiş vektörler ve FAISS ile tam kosinüs araması kullanılarak Recall@1/5/10/20 ve mAP ile karşılaştırılacak; sonuçlar DeepFashion2 makalesindeki Match R-CNN ile kıyaslanacak.</w:t>
-      </w:r>
-    </w:p>
-    <w:p>
-      <w:pPr>
-        <w:pStyle w:val="Heading1"/>
-      </w:pPr>
-      <w:r>
-        <w:t>3. Karşılaştırılan modeller</w:t>
-      </w:r>
-    </w:p>
-    <w:p>
-      <w:r>
-        <w:rPr>
-          <w:b/>
-        </w:rPr>
-        <w:t>Tablo 1. Dört omurga</w:t>
-      </w:r>
-    </w:p>
-    <w:tbl>
-      <w:tblPr>
-        <w:tblStyle w:val="TableGrid"/>
-        <w:tblW w:type="auto" w:w="0"/>
-        <w:jc w:val="center"/>
-        <w:tblLook w:firstColumn="1" w:firstRow="1" w:lastColumn="0" w:lastRow="0" w:noHBand="0" w:noVBand="1" w:val="04A0"/>
-      </w:tblPr>
-      <w:tblGrid>
-        <w:gridCol w:w="2880"/>
-        <w:gridCol w:w="2880"/>
-        <w:gridCol w:w="2880"/>
-      </w:tblGrid>
-      <w:tr>
-        <w:tc>
-          <w:tcPr>
-            <w:tcW w:type="dxa" w:w="2880"/>
-            <w:shd w:val="clear" w:color="auto" w:fill="D9E2F3"/>
-          </w:tcPr>
-          <w:p>
-            <w:r>
-              <w:rPr>
-                <w:b/>
-              </w:rPr>
-              <w:t>Model</w:t>
-            </w:r>
-          </w:p>
-        </w:tc>
-        <w:tc>
-          <w:tcPr>
-            <w:tcW w:type="dxa" w:w="2880"/>
-            <w:shd w:val="clear" w:color="auto" w:fill="D9E2F3"/>
-          </w:tcPr>
-          <w:p>
-            <w:r>
-              <w:rPr>
-                <w:b/>
-              </w:rPr>
-              <w:t>Nedir?</w:t>
-            </w:r>
-          </w:p>
-        </w:tc>
-        <w:tc>
-          <w:tcPr>
-            <w:tcW w:type="dxa" w:w="2880"/>
-            <w:shd w:val="clear" w:color="auto" w:fill="D9E2F3"/>
-          </w:tcPr>
-          <w:p>
-            <w:r>
-              <w:rPr>
-                <w:b/>
-              </w:rPr>
-              <w:t>Vektör boyutu</w:t>
-            </w:r>
-          </w:p>
-        </w:tc>
-      </w:tr>
-      <w:tr>
-        <w:tc>
-          <w:tcPr>
-            <w:tcW w:type="dxa" w:w="2880"/>
-          </w:tcPr>
-          <w:p>
-            <w:r>
-              <w:t>ResNet-50 (ImageNet)</w:t>
-            </w:r>
-          </w:p>
-        </w:tc>
-        <w:tc>
-          <w:tcPr>
-            <w:tcW w:type="dxa" w:w="2880"/>
-          </w:tcPr>
-          <w:p>
-            <w:r>
-              <w:t>2015'ten kalma klasik evrişimli ağ; ImageNet'te 1000 sınıf tanımak için eğitilmiş. Fotoğrafı 2048 sayıyla özetler.</w:t>
-            </w:r>
-          </w:p>
-        </w:tc>
-        <w:tc>
-          <w:tcPr>
-            <w:tcW w:type="dxa" w:w="2880"/>
-          </w:tcPr>
-          <w:p>
-            <w:r>
-              <w:t>2.048</w:t>
-            </w:r>
-          </w:p>
-        </w:tc>
-      </w:tr>
-      <w:tr>
-        <w:tc>
-          <w:tcPr>
-            <w:tcW w:type="dxa" w:w="2880"/>
-          </w:tcPr>
-          <w:p>
-            <w:r>
-              <w:t>CLIP ViT-B/16</w:t>
-            </w:r>
-          </w:p>
-        </w:tc>
-        <w:tc>
-          <w:tcPr>
-            <w:tcW w:type="dxa" w:w="2880"/>
-          </w:tcPr>
-          <w:p>
-            <w:r>
-              <w:t>OpenAI'ın 400 milyon görüntü–metin çiftiyle eğittiği model; resmi ve açıklamasını eşleştirmeyi öğrenmiş. 512 sayı.</w:t>
-            </w:r>
-          </w:p>
-        </w:tc>
-        <w:tc>
-          <w:tcPr>
-            <w:tcW w:type="dxa" w:w="2880"/>
-          </w:tcPr>
-          <w:p>
-            <w:r>
-              <w:t>512</w:t>
-            </w:r>
-          </w:p>
-        </w:tc>
-      </w:tr>
-      <w:tr>
-        <w:tc>
-          <w:tcPr>
-            <w:tcW w:type="dxa" w:w="2880"/>
-          </w:tcPr>
-          <w:p>
-            <w:r>
-              <w:t>SigLIP ViT-B/16</w:t>
-            </w:r>
-          </w:p>
-        </w:tc>
-        <w:tc>
-          <w:tcPr>
-            <w:tcW w:type="dxa" w:w="2880"/>
-          </w:tcPr>
-          <w:p>
-            <w:r>
-              <w:t>Google'ın CLIP benzeri ama daha iyi bir kayıp fonksiyonuyla (sigmoid) eğittiği model; 768 sayı.</w:t>
-            </w:r>
-          </w:p>
-        </w:tc>
-        <w:tc>
-          <w:tcPr>
-            <w:tcW w:type="dxa" w:w="2880"/>
-          </w:tcPr>
-          <w:p>
-            <w:r>
-              <w:t>768</w:t>
-            </w:r>
-          </w:p>
-        </w:tc>
-      </w:tr>
-      <w:tr>
-        <w:tc>
-          <w:tcPr>
-            <w:tcW w:type="dxa" w:w="2880"/>
-          </w:tcPr>
-          <w:p>
-            <w:r>
-              <w:t>DINOv2 ViT-B/14</w:t>
-            </w:r>
-          </w:p>
-        </w:tc>
-        <w:tc>
-          <w:tcPr>
-            <w:tcW w:type="dxa" w:w="2880"/>
-          </w:tcPr>
-          <w:p>
-            <w:r>
-              <w:t>Meta'nın hiç etiket kullanmadan 142 milyon görüntüyle eğittiği model; genel görsel yapıyı öğrenmesiyle bilinir. 768 sayı.</w:t>
-            </w:r>
-          </w:p>
-        </w:tc>
-        <w:tc>
-          <w:tcPr>
-            <w:tcW w:type="dxa" w:w="2880"/>
-          </w:tcPr>
-          <w:p>
-            <w:r>
-              <w:t>768</w:t>
-            </w:r>
-          </w:p>
-        </w:tc>
-      </w:tr>
-    </w:tbl>
-    <w:p/>
-    <w:p>
-      <w:pPr>
-        <w:pStyle w:val="Heading1"/>
-      </w:pPr>
-      <w:r>
-        <w:t>4. Ne yaptık?</w:t>
+        <w:t>Adım 1'de her kıyafet bir kırpıntı (küçük JPEG) oldu. Bir müşteri kırpıntısına en çok benzeyen mağaza kırpıntısını bulmak için iki görüntüyü karşılaştırabilen bir ölçü gerekir. Piksel piksel karşılaştırma işe yaramaz: aynı tişört farklı ışıkta, farklı pozda, farklı arka planda tamamen farklı piksel değerleri verir. Bunun yerine her görüntü önce bir 'vektöre' çevrilir ve vektörler karşılaştırılır. Bu adımın sorusu: hiç ek eğitim yapmadan, hazır dört modelden hangisi bu iş için en iyi vektörü üretir? (Araştırma Sorusu 1)</w:t>
       </w:r>
     </w:p>
     <w:p>
@@ -335,7 +74,7 @@
               <a:graphicData uri="http://schemas.openxmlformats.org/drawingml/2006/picture">
                 <pic:pic>
                   <pic:nvPicPr>
-                    <pic:cNvPr id="0" name="pipeline.png"/>
+                    <pic:cNvPr id="0" name="embed_flow.png"/>
                     <pic:cNvPicPr/>
                   </pic:nvPicPr>
                   <pic:blipFill>
@@ -368,7 +107,896 @@
           <w:color w:val="52514E"/>
           <w:sz w:val="18"/>
         </w:rPr>
-        <w:t>Şekil 1. Kırpıntılardan başarı tablosuna.</w:t>
+        <w:t>Şekil 1. Her kırpıntı için izlenen yol. Model 'dondurulmuş': ağırlıkları hiç değiştirilmiyor.</w:t>
+      </w:r>
+    </w:p>
+    <w:p>
+      <w:pPr>
+        <w:pStyle w:val="Heading1"/>
+      </w:pPr>
+      <w:r>
+        <w:t>2. Temel kavramlar</w:t>
+      </w:r>
+    </w:p>
+    <w:p>
+      <w:pPr>
+        <w:pStyle w:val="Heading2"/>
+      </w:pPr>
+      <w:r>
+        <w:t>2.1 Görüntüden vektöre (gömme / embedding)</w:t>
+      </w:r>
+    </w:p>
+    <w:p>
+      <w:r>
+        <w:t>Bir kırpıntı, 224×224×3 = 150.528 sayıdan oluşan bir matristir. Bir derin öğrenme modeli, bu matrisi girdi alıp çıktı olarak sabit uzunlukta bir sayı dizisi veren bir fonksiyondur: f(görüntü) = (v₁, v₂, …, v_D). D modele göre 512, 768 ya da 2048. Bu diziye vektör ya da gömme (embedding) denir.</w:t>
+      </w:r>
+    </w:p>
+    <w:p>
+      <w:r>
+        <w:t>Fonksiyonun içinde milyonlarca ayarlanabilir sayı (ağırlık) vardır. 'Eğitim', bu ağırlıkların büyük bir veri kümesi üzerinde, belirli bir hedefi iyileştirecek şekilde yavaş yavaş değiştirilmesidir. 'Hazır (pretrained) model', başkalarının bu eğitimi yapıp ağırlıkları yayınladığı modeldir. 'Eğitimsiz (zero-shot) kullanım' ise bu ağırlıkları olduğu gibi alıp hiç değiştirmeden kendi verimize uygulamak demektir; bu adımda yapılan budur.</w:t>
+      </w:r>
+    </w:p>
+    <w:p>
+      <w:r>
+        <w:t>İyi bir vektörün özelliği şudur: aynı ürünün iki farklı fotoğrafı birbirine yakın vektörler verir, farklı ürünler uzak vektörler. Modelin eğitim hedefi bu özelliği ne kadar üretiyorsa, o model bizim işimizde o kadar iyi olur. Dört modelin eğitim hedefleri farklı; fark da buradan çıkar (Bölüm 3).</w:t>
+      </w:r>
+    </w:p>
+    <w:p>
+      <w:pPr>
+        <w:pStyle w:val="Heading2"/>
+      </w:pPr>
+      <w:r>
+        <w:t>2.2 İki vektör ne kadar benzer? Kosinüs benzerliği</w:t>
+      </w:r>
+    </w:p>
+    <w:p>
+      <w:r>
+        <w:t>İki vektörün benzerliği aralarındaki açıyla ölçülür. Önce her vektör kendi uzunluğuna bölünür (L2 normalizasyon); böylece her vektörün uzunluğu 1 olur ve yalnızca yönü kalır. Sonra iki birim vektörün nokta çarpımı (karşılıklı elemanları çarpıp toplamak) alınır. Bu sayı aradaki açının kosinüsüdür: 1 = aynı yön (en benzer), 0 = dik (ilgisiz), −1 = zıt. Üç boyutlu küçük bir örnek:</w:t>
+      </w:r>
+    </w:p>
+    <w:p>
+      <w:r>
+        <w:rPr>
+          <w:b/>
+        </w:rPr>
+        <w:t>Tablo 1. L2 normalizasyon örneği</w:t>
+      </w:r>
+    </w:p>
+    <w:tbl>
+      <w:tblPr>
+        <w:tblStyle w:val="TableGrid"/>
+        <w:tblW w:type="auto" w:w="0"/>
+        <w:jc w:val="center"/>
+        <w:tblLook w:firstColumn="1" w:firstRow="1" w:lastColumn="0" w:lastRow="0" w:noHBand="0" w:noVBand="1" w:val="04A0"/>
+      </w:tblPr>
+      <w:tblGrid>
+        <w:gridCol w:w="1080"/>
+        <w:gridCol w:w="1080"/>
+        <w:gridCol w:w="1080"/>
+        <w:gridCol w:w="1080"/>
+        <w:gridCol w:w="1080"/>
+        <w:gridCol w:w="1080"/>
+        <w:gridCol w:w="1080"/>
+        <w:gridCol w:w="1080"/>
+      </w:tblGrid>
+      <w:tr>
+        <w:tc>
+          <w:tcPr>
+            <w:tcW w:type="dxa" w:w="1080"/>
+            <w:shd w:val="clear" w:color="auto" w:fill="D9E2F3"/>
+          </w:tcPr>
+          <w:p>
+            <w:r>
+              <w:rPr>
+                <w:b/>
+              </w:rPr>
+              <w:t>vektör</w:t>
+            </w:r>
+          </w:p>
+        </w:tc>
+        <w:tc>
+          <w:tcPr>
+            <w:tcW w:type="dxa" w:w="1080"/>
+            <w:shd w:val="clear" w:color="auto" w:fill="D9E2F3"/>
+          </w:tcPr>
+          <w:p>
+            <w:r>
+              <w:rPr>
+                <w:b/>
+              </w:rPr>
+              <w:t>v₁</w:t>
+            </w:r>
+          </w:p>
+        </w:tc>
+        <w:tc>
+          <w:tcPr>
+            <w:tcW w:type="dxa" w:w="1080"/>
+            <w:shd w:val="clear" w:color="auto" w:fill="D9E2F3"/>
+          </w:tcPr>
+          <w:p>
+            <w:r>
+              <w:rPr>
+                <w:b/>
+              </w:rPr>
+              <w:t>v₂</w:t>
+            </w:r>
+          </w:p>
+        </w:tc>
+        <w:tc>
+          <w:tcPr>
+            <w:tcW w:type="dxa" w:w="1080"/>
+            <w:shd w:val="clear" w:color="auto" w:fill="D9E2F3"/>
+          </w:tcPr>
+          <w:p>
+            <w:r>
+              <w:rPr>
+                <w:b/>
+              </w:rPr>
+              <w:t>v₃</w:t>
+            </w:r>
+          </w:p>
+        </w:tc>
+        <w:tc>
+          <w:tcPr>
+            <w:tcW w:type="dxa" w:w="1080"/>
+            <w:shd w:val="clear" w:color="auto" w:fill="D9E2F3"/>
+          </w:tcPr>
+          <w:p>
+            <w:r>
+              <w:rPr>
+                <w:b/>
+              </w:rPr>
+              <w:t>uzunluk</w:t>
+            </w:r>
+          </w:p>
+        </w:tc>
+        <w:tc>
+          <w:tcPr>
+            <w:tcW w:type="dxa" w:w="1080"/>
+            <w:shd w:val="clear" w:color="auto" w:fill="D9E2F3"/>
+          </w:tcPr>
+          <w:p>
+            <w:r>
+              <w:rPr>
+                <w:b/>
+              </w:rPr>
+              <w:t>normalize v₁</w:t>
+            </w:r>
+          </w:p>
+        </w:tc>
+        <w:tc>
+          <w:tcPr>
+            <w:tcW w:type="dxa" w:w="1080"/>
+            <w:shd w:val="clear" w:color="auto" w:fill="D9E2F3"/>
+          </w:tcPr>
+          <w:p>
+            <w:r>
+              <w:rPr>
+                <w:b/>
+              </w:rPr>
+              <w:t>v₂</w:t>
+            </w:r>
+          </w:p>
+        </w:tc>
+        <w:tc>
+          <w:tcPr>
+            <w:tcW w:type="dxa" w:w="1080"/>
+            <w:shd w:val="clear" w:color="auto" w:fill="D9E2F3"/>
+          </w:tcPr>
+          <w:p>
+            <w:r>
+              <w:rPr>
+                <w:b/>
+              </w:rPr>
+              <w:t>v₃</w:t>
+            </w:r>
+          </w:p>
+        </w:tc>
+      </w:tr>
+      <w:tr>
+        <w:tc>
+          <w:tcPr>
+            <w:tcW w:type="dxa" w:w="1080"/>
+          </w:tcPr>
+          <w:p>
+            <w:r>
+              <w:t>a</w:t>
+            </w:r>
+          </w:p>
+        </w:tc>
+        <w:tc>
+          <w:tcPr>
+            <w:tcW w:type="dxa" w:w="1080"/>
+          </w:tcPr>
+          <w:p>
+            <w:r>
+              <w:t>3,000</w:t>
+            </w:r>
+          </w:p>
+        </w:tc>
+        <w:tc>
+          <w:tcPr>
+            <w:tcW w:type="dxa" w:w="1080"/>
+          </w:tcPr>
+          <w:p>
+            <w:r>
+              <w:t>4,000</w:t>
+            </w:r>
+          </w:p>
+        </w:tc>
+        <w:tc>
+          <w:tcPr>
+            <w:tcW w:type="dxa" w:w="1080"/>
+          </w:tcPr>
+          <w:p>
+            <w:r>
+              <w:t>0,000</w:t>
+            </w:r>
+          </w:p>
+        </w:tc>
+        <w:tc>
+          <w:tcPr>
+            <w:tcW w:type="dxa" w:w="1080"/>
+          </w:tcPr>
+          <w:p>
+            <w:r>
+              <w:t>5,000</w:t>
+            </w:r>
+          </w:p>
+        </w:tc>
+        <w:tc>
+          <w:tcPr>
+            <w:tcW w:type="dxa" w:w="1080"/>
+          </w:tcPr>
+          <w:p>
+            <w:r>
+              <w:t>0,600</w:t>
+            </w:r>
+          </w:p>
+        </w:tc>
+        <w:tc>
+          <w:tcPr>
+            <w:tcW w:type="dxa" w:w="1080"/>
+          </w:tcPr>
+          <w:p>
+            <w:r>
+              <w:t>0,800</w:t>
+            </w:r>
+          </w:p>
+        </w:tc>
+        <w:tc>
+          <w:tcPr>
+            <w:tcW w:type="dxa" w:w="1080"/>
+          </w:tcPr>
+          <w:p>
+            <w:r>
+              <w:t>0,000</w:t>
+            </w:r>
+          </w:p>
+        </w:tc>
+      </w:tr>
+      <w:tr>
+        <w:tc>
+          <w:tcPr>
+            <w:tcW w:type="dxa" w:w="1080"/>
+          </w:tcPr>
+          <w:p>
+            <w:r>
+              <w:t>b</w:t>
+            </w:r>
+          </w:p>
+        </w:tc>
+        <w:tc>
+          <w:tcPr>
+            <w:tcW w:type="dxa" w:w="1080"/>
+          </w:tcPr>
+          <w:p>
+            <w:r>
+              <w:t>1,000</w:t>
+            </w:r>
+          </w:p>
+        </w:tc>
+        <w:tc>
+          <w:tcPr>
+            <w:tcW w:type="dxa" w:w="1080"/>
+          </w:tcPr>
+          <w:p>
+            <w:r>
+              <w:t>2,000</w:t>
+            </w:r>
+          </w:p>
+        </w:tc>
+        <w:tc>
+          <w:tcPr>
+            <w:tcW w:type="dxa" w:w="1080"/>
+          </w:tcPr>
+          <w:p>
+            <w:r>
+              <w:t>2,000</w:t>
+            </w:r>
+          </w:p>
+        </w:tc>
+        <w:tc>
+          <w:tcPr>
+            <w:tcW w:type="dxa" w:w="1080"/>
+          </w:tcPr>
+          <w:p>
+            <w:r>
+              <w:t>3,000</w:t>
+            </w:r>
+          </w:p>
+        </w:tc>
+        <w:tc>
+          <w:tcPr>
+            <w:tcW w:type="dxa" w:w="1080"/>
+          </w:tcPr>
+          <w:p>
+            <w:r>
+              <w:t>0,333</w:t>
+            </w:r>
+          </w:p>
+        </w:tc>
+        <w:tc>
+          <w:tcPr>
+            <w:tcW w:type="dxa" w:w="1080"/>
+          </w:tcPr>
+          <w:p>
+            <w:r>
+              <w:t>0,667</w:t>
+            </w:r>
+          </w:p>
+        </w:tc>
+        <w:tc>
+          <w:tcPr>
+            <w:tcW w:type="dxa" w:w="1080"/>
+          </w:tcPr>
+          <w:p>
+            <w:r>
+              <w:t>0,667</w:t>
+            </w:r>
+          </w:p>
+        </w:tc>
+      </w:tr>
+    </w:tbl>
+    <w:p/>
+    <w:p>
+      <w:r>
+        <w:t>a'nın uzunluğu √(3²+4²+0²) = 5; b'ninki √(1+4+4) = 3. Normalize edilmiş vektörlerin nokta çarpımı: 0,6·0,333 + 0,8·0,667 + 0·0,667 = 0.733. Bu iki vektörün kosinüs benzerliği 0.733. (Ham nokta çarpım 11 olurdu; normalize etmeden uzun vektörler haksız yere 'benzer' görünür, bu yüzden normalize ediyoruz.) Bizim vektörlerimiz 768 boyutlu ama işlem aynı.</w:t>
+      </w:r>
+    </w:p>
+    <w:p>
+      <w:pPr>
+        <w:pStyle w:val="Heading2"/>
+      </w:pPr>
+      <w:r>
+        <w:t>2.3 Arama: her sorguyu bütün katalogla karşılaştırmak</w:t>
+      </w:r>
+    </w:p>
+    <w:p>
+      <w:r>
+        <w:t>Test kataloğunda 36.958 vektör var. Bir sorgu vektörü için bütün katalog vektörleriyle nokta çarpımı alınır (tek bir matris çarpımı: sorgu 1×768. katalog 768×36.958 → 36.958 benzerlik sayısı). sayılar büyükten küçüğe sıralanır. ilk K tanesi cevaptır. Bu işi FAISS kütüphanesinin IndexFlatIP yapısı yapar: 'Flat' = bütün vektörler olduğu gibi bellekte. 'IP' = iç çarpım (inner product). Yaklaşık arama yöntemleri (katalogun bir kısmına bakıp hız kazanan) kullanılmadı; her sorgu için kesin sonuç alınır. Sorgu başına süre 0.30 ms (CPU).</w:t>
+      </w:r>
+    </w:p>
+    <w:p>
+      <w:pPr>
+        <w:pStyle w:val="Heading1"/>
+      </w:pPr>
+      <w:r>
+        <w:t>3. Karşılaştırılan dört model</w:t>
+      </w:r>
+    </w:p>
+    <w:p>
+      <w:r>
+        <w:t>Dördü de 'görüntü → vektör' fonksiyonudur; farkları mimari (hesabı nasıl yaptıkları) ve eğitim hedefi (ağırlıkların ne için ayarlandığı).</w:t>
+      </w:r>
+    </w:p>
+    <w:p>
+      <w:pPr>
+        <w:pStyle w:val="Heading2"/>
+      </w:pPr>
+      <w:r>
+        <w:t>3.1 ResNet-50 — evrişimli ağ, ImageNet sınıflandırmasıyla eğitilmiş</w:t>
+      </w:r>
+    </w:p>
+    <w:p>
+      <w:r>
+        <w:t>Mimari: Evrişimli sinir ağı (CNN). Temel işlem evrişimdir: 3×3 piksellik küçük bir ağırlık tablosu (filtre) görüntünün üzerinde kaydırılır; her konumda filtre ile altındaki 3×3 piksel bloğunun ağırlıklı toplamı alınır ve tek bir sayı üretilir. Bir filtre görüntünün tamamı üzerinde gezince yeni bir 'harita' çıkar; 64 filtre 64 harita üretir. Bu haritalara aynı işlem tekrar uygulanır: 50 katman üst üste. Alt katmanlar kenar ve renk geçişi gibi basit şeylere, üst katmanlar desen, doku ve nesne parçalarına tepki verir. Her birkaç katmanda haritalar yarıya küçültülür (pooling), böylece üst katmanlar görüntünün daha geniş bölgesini görür. 'Res' (residual): her katman bloğu girdisini çıktısına ekler (çıktı = girdi + öğrenilen düzeltme); bu, 50 katmanlı derin ağın eğitilebilmesini sağlayan buluştur (2015).</w:t>
+      </w:r>
+    </w:p>
+    <w:p>
+      <w:r>
+        <w:t>Eğitim hedefi: ImageNet'teki 1,28 milyon fotoğrafı 1000 sınıfa (köpek cinsleri, araç türleri, nesneler…) ayırmak. Son katman bu 1000 sınıfın puanını verir. Biz son katmanı atıp bir öncekini kullanıyoruz: son haritaların her birinin ortalaması alınır (global average pooling) → 2048 sayı. Bu vektör 'ImageNet sınıflarını ayırt etmeye yarayan' bilgiyi taşır; kıyafet kimliği için eğitilmemiştir.</w:t>
+      </w:r>
+    </w:p>
+    <w:p>
+      <w:pPr>
+        <w:pStyle w:val="Heading2"/>
+      </w:pPr>
+      <w:r>
+        <w:t>3.2 Vision Transformer (ViT) — diğer üç modelin ortak mimarisi</w:t>
+      </w:r>
+    </w:p>
+    <w:p>
+      <w:r>
+        <w:t>CLIP, SigLIP ve DINOv2 aynı mimariyi kullanır: Vision Transformer, 'Base' boyutu (ViT-B, 86 milyon ağırlık). Çalışması:</w:t>
+      </w:r>
+    </w:p>
+    <w:p>
+      <w:pPr>
+        <w:pStyle w:val="ListNumber"/>
+      </w:pPr>
+      <w:r>
+        <w:t>Görüntü 224×224'e getirilir ve 16×16 piksellik parçalara (patch) bölünür: 14×14 = 196 parça (DINOv2'de parça 14×14 piksel, 256 parça). Şekil 2.</w:t>
+      </w:r>
+    </w:p>
+    <w:p>
+      <w:pPr>
+        <w:pStyle w:val="ListNumber"/>
+      </w:pPr>
+      <w:r>
+        <w:t>Her parça 16×16×3 = 768 sayıdır; bu sayılar bir ağırlık matrisiyle çarpılarak 768 boyutlu bir 'token'a dönüşür. Parçanın konumunu belirten öğrenilmiş bir vektör eklenir (ağ aksi hâlde parçaların sırasını bilmez).</w:t>
+      </w:r>
+    </w:p>
+    <w:p>
+      <w:pPr>
+        <w:pStyle w:val="ListNumber"/>
+      </w:pPr>
+      <w:r>
+        <w:t>Başa, görüntüye ait olmayan özel bir token eklenir: CLS. Toplam 197 token.</w:t>
+      </w:r>
+    </w:p>
+    <w:p>
+      <w:pPr>
+        <w:pStyle w:val="ListNumber"/>
+      </w:pPr>
+      <w:r>
+        <w:t>12 katman 'öz-dikkat' (self-attention): her token, diğer bütün token'lara 'bakar'. Somut olarak: her token için üç vektör hesaplanır (sorgu q, anahtar k, değer v = token × üç ayrı ağırlık matrisi); token i'nin token j'ye vereceği ağırlık qᵢ·kⱼ nokta çarpımından (softmax ile 0–1 arasına ve toplamı 1'e getirilerek) bulunur; token i'nin yeni değeri, bütün vⱼ'lerin bu ağırlıklarla toplamıdır. Böylece 'yaka' parçası 'etek ucu' parçasından bilgi alabilir — CNN'de bu ancak çok katman sonra mümkündür. Her katmanda ayrıca küçük bir tam bağlantılı ağ (MLP) her token'ı ayrı ayrı dönüştürür.</w:t>
+      </w:r>
+    </w:p>
+    <w:p>
+      <w:pPr>
+        <w:pStyle w:val="ListNumber"/>
+      </w:pPr>
+      <w:r>
+        <w:t>12 katman sonunda CLS token'ının değeri (768 sayı) görüntünün özeti olarak alınır. (CLIP'te bunun üstünde bir projeksiyon daha var → 512.)</w:t>
+      </w:r>
+    </w:p>
+    <w:p>
+      <w:pPr>
+        <w:jc w:val="center"/>
+      </w:pPr>
+      <w:r>
+        <w:drawing>
+          <wp:inline xmlns:a="http://schemas.openxmlformats.org/drawingml/2006/main" xmlns:pic="http://schemas.openxmlformats.org/drawingml/2006/picture">
+            <wp:extent cx="4572000" cy="2368116"/>
+            <wp:docPr id="2" name="Picture 2"/>
+            <wp:cNvGraphicFramePr>
+              <a:graphicFrameLocks noChangeAspect="1"/>
+            </wp:cNvGraphicFramePr>
+            <a:graphic>
+              <a:graphicData uri="http://schemas.openxmlformats.org/drawingml/2006/picture">
+                <pic:pic>
+                  <pic:nvPicPr>
+                    <pic:cNvPr id="0" name="vit_patches.png"/>
+                    <pic:cNvPicPr/>
+                  </pic:nvPicPr>
+                  <pic:blipFill>
+                    <a:blip r:embed="rId10"/>
+                    <a:stretch>
+                      <a:fillRect/>
+                    </a:stretch>
+                  </pic:blipFill>
+                  <pic:spPr>
+                    <a:xfrm>
+                      <a:off x="0" y="0"/>
+                      <a:ext cx="4572000" cy="2368116"/>
+                    </a:xfrm>
+                    <a:prstGeom prst="rect"/>
+                  </pic:spPr>
+                </pic:pic>
+              </a:graphicData>
+            </a:graphic>
+          </wp:inline>
+        </w:drawing>
+      </w:r>
+    </w:p>
+    <w:p>
+      <w:pPr>
+        <w:jc w:val="center"/>
+      </w:pPr>
+      <w:r>
+        <w:rPr>
+          <w:i/>
+          <w:color w:val="52514E"/>
+          <w:sz w:val="18"/>
+        </w:rPr>
+        <w:t>Şekil 2. ViT'in gördüğü şey: 224×224 görüntü, 196 parça. Her parça bir token olur; dikkat mekanizması parçaları birbirine bağlar.</w:t>
+      </w:r>
+    </w:p>
+    <w:p>
+      <w:pPr>
+        <w:pStyle w:val="Heading2"/>
+      </w:pPr>
+      <w:r>
+        <w:t>3.3 CLIP — görüntü ve metni aynı uzayda eşleştirmeyi öğrenmiş</w:t>
+      </w:r>
+    </w:p>
+    <w:p>
+      <w:r>
+        <w:t>OpenAI, 2021. İki ayrı ağ: görüntü için ViT-B/16, metin için bir Transformer. İnternetten toplanan 400 milyon (fotoğraf, açıklama metni) çifti ile eğitildi. Eğitim hedefi (kontrastif): bir grupta N çift alınır (örneğin N = 32.768). N görüntü vektörü ile N metin vektörünün bütün ikili kosinüs benzerlikleri hesaplanır (N×N tablo). Hedef, her satırda doğru eşin (köşegen) diğer N−1 yanlış eşten yüksek çıkması: her satıra softmax uygulanıp doğru hücrenin olasılığı artırılır. Sonuçta görüntü vektörleri, 'metinle anlatılabilen içeriğe' göre düzenlenir: 'kırmızı çiçekli elbise' yazısına yakın görüntüler birbirine de yakın olur. Biz yalnızca görüntü ağını kullanıyoruz; vektör 512 boyutlu.</w:t>
+      </w:r>
+    </w:p>
+    <w:p>
+      <w:r>
+        <w:rPr>
+          <w:i/>
+          <w:color w:val="404040"/>
+        </w:rPr>
+        <w:t>Bu projede fark edilen bir ayrıntı: OpenAI ağırlıkları 'QuickGELU' adlı bir aktivasyon fonksiyonuyla (x·sigmoid(1,702x)) eğitilmiş; kütüphanenin varsayılanı standart GELU'ydu. Ağırlıklar aynı ama ara hesaplar biraz farklı çıkınca vektörler bozuluyordu. Düzeltilip CLIP vektörleri yeniden çıkarıldı (256 örneklik denemede R@5 0,18 → 0,22).</w:t>
+      </w:r>
+    </w:p>
+    <w:p>
+      <w:pPr>
+        <w:pStyle w:val="Heading2"/>
+      </w:pPr>
+      <w:r>
+        <w:t>3.4 SigLIP — CLIP'in geliştirilmiş kaybıyla eğitilmiş</w:t>
+      </w:r>
+    </w:p>
+    <w:p>
+      <w:r>
+        <w:t>Google, 2023. Aynı kurulum (ViT-B/16 görüntü ağı + metin ağı, görüntü–metin çiftleri; WebLI veri seti, milyarlarca çift). Fark eğitim hedefinde: CLIP her satırı N'li bir yarış olarak değerlendirir (softmax, bütün grubun normalizasyonu gerekir). SigLIP ise her (görüntü, metin) hücresini bağımsız bir evet/hayır sorusu olarak ele alır: doğru çift için sigmoid(benzerlik) → 1'e, yanlış çiftler için → 0'a itilir. Bu, çok daha büyük gruplarla ve daha kararlı eğitim sağlar; yayınlanan sonuçlarda aynı boyutta CLIP'ten daha iyi görüntü vektörleri verir. Vektör 768 boyutlu. Ön işlemesi de farklı: görüntüyü kırpmadan 224×224'e sıkıştırır.</w:t>
+      </w:r>
+    </w:p>
+    <w:p>
+      <w:pPr>
+        <w:pStyle w:val="Heading2"/>
+      </w:pPr>
+      <w:r>
+        <w:t>3.5 DINOv2 — etiketsiz, kendi kendine öğrenmiş</w:t>
+      </w:r>
+    </w:p>
+    <w:p>
+      <w:r>
+        <w:t>Meta, 2023. Ne sınıf etiketi ne metin kullanır (self-supervised). 142 milyon özenle seçilmiş fotoğrafla eğitildi. Yöntem: aynı fotoğraftan iki farklı görünüm üretilir (farklı bölge kırpılır, renk oynanır). 'Öğrenci' ağ bir görünümü, 'öğretmen' ağ diğerini görür; öğrenci, öğretmenin çıktısını tahmin etmeye zorlanır. Öğretmen ayrı eğitilmez; ağırlıkları öğrencinin ağırlıklarının yavaş hareket eden ortalamasıdır. Ek olarak görüntünün bazı parçaları gizlenir ve öğrenci gizli parçaların öğretmen çıktısını tahmin eder. Sonuçta ağ, 'aynı fotoğrafın parçaları birbiriyle tutarlı olmalı' ilkesinden görsel yapı öğrenir; nesne parçaları, doku ve geometri konusunda çok güçlüdür. Vektör 768 boyutlu (CLS token). Orijinal çözünürlük 518 piksel; biz 224'te çalıştırdık (konum vektörleri yeniden örneklendi).</w:t>
+      </w:r>
+    </w:p>
+    <w:p>
+      <w:pPr>
+        <w:pStyle w:val="Heading2"/>
+      </w:pPr>
+      <w:r>
+        <w:t>3.6 Ön işleme ve hassasiyet</w:t>
+      </w:r>
+    </w:p>
+    <w:p>
+      <w:r>
+        <w:t>Her modelin kendi resmi ön işleme adımı kullanıldı: ResNet kısa kenarı 235'e getirip ortadan 224×224 keser; CLIP ve DINOv2 224'e getirip ortadan keser; SigLIP ortadan kesmeden 224×224'e sıkıştırır. Sonra her kanaldan modelin eğitimde kullandığı ortalama çıkarılır, standart sapmaya bölünür (ResNet/DINOv2: ortalama 0,485/0,456/0,406, sapma 0,229/0,224/0,225). Hesaplar 16-bit kayan noktayla (fp16) yapıldı: hız iki kat, bellek yarı; 256 örnekte fp32 ile sonuç birebir aynı çıktı.</w:t>
+      </w:r>
+    </w:p>
+    <w:p>
+      <w:r>
+        <w:rPr>
+          <w:i/>
+          <w:color w:val="404040"/>
+        </w:rPr>
+        <w:t>Denenen ve reddedilen bir fikir: kırpıntılar dikey olduğu için (yükseklik/genişlik medyanı 1,3) 'ortadan kes' adımının yaka ve etek ucunu attığı düşünüldü; dört modele de 'sıkıştır' uygulandı. 256 sorguluk bir denemede ResNet kötüleşti (R@1 0,094 → 0,059), diğerleri değişmedi. Resmi ön işlemelere dönüldü. DINOv2 için 448 piksel, parça-ortalaması havuzlama ve kenar doldurma da denendi; hiçbiri 0,10'u geçmedi.</w:t>
+      </w:r>
+    </w:p>
+    <w:p>
+      <w:pPr>
+        <w:pStyle w:val="Heading1"/>
+      </w:pPr>
+      <w:r>
+        <w:t>4. Başarı nasıl ölçülüyor?</w:t>
+      </w:r>
+    </w:p>
+    <w:p>
+      <w:r>
+        <w:t>Her sorgu için katalog sıralanır; doğru ürünler (aynı match_key) bu sıralamanın neresinde? Dört ölçü, hepsi 0–1 arası, yüksek iyi.</w:t>
+      </w:r>
+    </w:p>
+    <w:p>
+      <w:r>
+        <w:rPr>
+          <w:b/>
+        </w:rPr>
+        <w:t>Recall@K</w:t>
+      </w:r>
+      <w:r>
+        <w:t xml:space="preserve"> — doğru ürünlerden en az biri ilk K sonuç içindeyse sorgu 'başarılı'. Recall@K = başarılı sorgu sayısı / toplam sorgu. K = 1 en katı ('ilk sonuç doğru mu'), K = 20 en gevşek. Makalelerde 'top-K accuracy' de denir.</w:t>
+      </w:r>
+    </w:p>
+    <w:p>
+      <w:r>
+        <w:rPr>
+          <w:b/>
+        </w:rPr>
+        <w:t>mAP (mean average precision)</w:t>
+      </w:r>
+      <w:r>
+        <w:t xml:space="preserve"> — yalnızca ilk doğru sonuca değil bütün doğru sonuçların sırasına bakar. Bir sorgu için AP: her doğru sonucun bulunduğu sırada 'o sıraya kadar doğru oranı' hesaplanır, bunlar toplanıp katalogdaki doğru ürün sayısına bölünür. mAP bütün sorguların AP ortalaması.</w:t>
+      </w:r>
+    </w:p>
+    <w:p>
+      <w:r>
+        <w:t>Örnek: bir sorgunun katalogda 2 doğru eşi var; sistemin sıralamasında bunlar 2. ve 5. sırada çıktı:</w:t>
+      </w:r>
+    </w:p>
+    <w:p>
+      <w:r>
+        <w:rPr>
+          <w:b/>
+        </w:rPr>
+        <w:t>Tablo 2. Tek sorgu için örnek sıralama</w:t>
+      </w:r>
+    </w:p>
+    <w:tbl>
+      <w:tblPr>
+        <w:tblStyle w:val="TableGrid"/>
+        <w:tblW w:type="auto" w:w="0"/>
+        <w:jc w:val="center"/>
+        <w:tblLook w:firstColumn="1" w:firstRow="1" w:lastColumn="0" w:lastRow="0" w:noHBand="0" w:noVBand="1" w:val="04A0"/>
+      </w:tblPr>
+      <w:tblGrid>
+        <w:gridCol w:w="1234"/>
+        <w:gridCol w:w="1234"/>
+        <w:gridCol w:w="1234"/>
+        <w:gridCol w:w="1234"/>
+        <w:gridCol w:w="1234"/>
+        <w:gridCol w:w="1234"/>
+        <w:gridCol w:w="1234"/>
+      </w:tblGrid>
+      <w:tr>
+        <w:tc>
+          <w:tcPr>
+            <w:tcW w:type="dxa" w:w="1234"/>
+            <w:shd w:val="clear" w:color="auto" w:fill="D9E2F3"/>
+          </w:tcPr>
+          <w:p>
+            <w:r>
+              <w:rPr>
+                <w:b/>
+              </w:rPr>
+              <w:t>Sıra</w:t>
+            </w:r>
+          </w:p>
+        </w:tc>
+        <w:tc>
+          <w:tcPr>
+            <w:tcW w:type="dxa" w:w="1234"/>
+            <w:shd w:val="clear" w:color="auto" w:fill="D9E2F3"/>
+          </w:tcPr>
+          <w:p>
+            <w:r>
+              <w:rPr>
+                <w:b/>
+              </w:rPr>
+              <w:t>1</w:t>
+            </w:r>
+          </w:p>
+        </w:tc>
+        <w:tc>
+          <w:tcPr>
+            <w:tcW w:type="dxa" w:w="1234"/>
+            <w:shd w:val="clear" w:color="auto" w:fill="D9E2F3"/>
+          </w:tcPr>
+          <w:p>
+            <w:r>
+              <w:rPr>
+                <w:b/>
+              </w:rPr>
+              <w:t>2</w:t>
+            </w:r>
+          </w:p>
+        </w:tc>
+        <w:tc>
+          <w:tcPr>
+            <w:tcW w:type="dxa" w:w="1234"/>
+            <w:shd w:val="clear" w:color="auto" w:fill="D9E2F3"/>
+          </w:tcPr>
+          <w:p>
+            <w:r>
+              <w:rPr>
+                <w:b/>
+              </w:rPr>
+              <w:t>3</w:t>
+            </w:r>
+          </w:p>
+        </w:tc>
+        <w:tc>
+          <w:tcPr>
+            <w:tcW w:type="dxa" w:w="1234"/>
+            <w:shd w:val="clear" w:color="auto" w:fill="D9E2F3"/>
+          </w:tcPr>
+          <w:p>
+            <w:r>
+              <w:rPr>
+                <w:b/>
+              </w:rPr>
+              <w:t>4</w:t>
+            </w:r>
+          </w:p>
+        </w:tc>
+        <w:tc>
+          <w:tcPr>
+            <w:tcW w:type="dxa" w:w="1234"/>
+            <w:shd w:val="clear" w:color="auto" w:fill="D9E2F3"/>
+          </w:tcPr>
+          <w:p>
+            <w:r>
+              <w:rPr>
+                <w:b/>
+              </w:rPr>
+              <w:t>5</w:t>
+            </w:r>
+          </w:p>
+        </w:tc>
+        <w:tc>
+          <w:tcPr>
+            <w:tcW w:type="dxa" w:w="1234"/>
+            <w:shd w:val="clear" w:color="auto" w:fill="D9E2F3"/>
+          </w:tcPr>
+          <w:p>
+            <w:r>
+              <w:rPr>
+                <w:b/>
+              </w:rPr>
+              <w:t>6…</w:t>
+            </w:r>
+          </w:p>
+        </w:tc>
+      </w:tr>
+      <w:tr>
+        <w:tc>
+          <w:tcPr>
+            <w:tcW w:type="dxa" w:w="1234"/>
+          </w:tcPr>
+          <w:p>
+            <w:r>
+              <w:t>Doğru mu?</w:t>
+            </w:r>
+          </w:p>
+        </w:tc>
+        <w:tc>
+          <w:tcPr>
+            <w:tcW w:type="dxa" w:w="1234"/>
+          </w:tcPr>
+          <w:p>
+            <w:r>
+              <w:t>hayır</w:t>
+            </w:r>
+          </w:p>
+        </w:tc>
+        <w:tc>
+          <w:tcPr>
+            <w:tcW w:type="dxa" w:w="1234"/>
+          </w:tcPr>
+          <w:p>
+            <w:r>
+              <w:t>EVET</w:t>
+            </w:r>
+          </w:p>
+        </w:tc>
+        <w:tc>
+          <w:tcPr>
+            <w:tcW w:type="dxa" w:w="1234"/>
+          </w:tcPr>
+          <w:p>
+            <w:r>
+              <w:t>hayır</w:t>
+            </w:r>
+          </w:p>
+        </w:tc>
+        <w:tc>
+          <w:tcPr>
+            <w:tcW w:type="dxa" w:w="1234"/>
+          </w:tcPr>
+          <w:p>
+            <w:r>
+              <w:t>hayır</w:t>
+            </w:r>
+          </w:p>
+        </w:tc>
+        <w:tc>
+          <w:tcPr>
+            <w:tcW w:type="dxa" w:w="1234"/>
+          </w:tcPr>
+          <w:p>
+            <w:r>
+              <w:t>EVET</w:t>
+            </w:r>
+          </w:p>
+        </w:tc>
+        <w:tc>
+          <w:tcPr>
+            <w:tcW w:type="dxa" w:w="1234"/>
+          </w:tcPr>
+          <w:p>
+            <w:r>
+              <w:t>hayır</w:t>
+            </w:r>
+          </w:p>
+        </w:tc>
+      </w:tr>
+      <w:tr>
+        <w:tc>
+          <w:tcPr>
+            <w:tcW w:type="dxa" w:w="1234"/>
+          </w:tcPr>
+          <w:p>
+            <w:r>
+              <w:t>O sıraya kadar doğru oranı</w:t>
+            </w:r>
+          </w:p>
+        </w:tc>
+        <w:tc>
+          <w:tcPr>
+            <w:tcW w:type="dxa" w:w="1234"/>
+          </w:tcPr>
+          <w:p>
+            <w:r>
+              <w:t>0/1</w:t>
+            </w:r>
+          </w:p>
+        </w:tc>
+        <w:tc>
+          <w:tcPr>
+            <w:tcW w:type="dxa" w:w="1234"/>
+          </w:tcPr>
+          <w:p>
+            <w:r>
+              <w:t>1/2</w:t>
+            </w:r>
+          </w:p>
+        </w:tc>
+        <w:tc>
+          <w:tcPr>
+            <w:tcW w:type="dxa" w:w="1234"/>
+          </w:tcPr>
+          <w:p>
+            <w:r>
+              <w:t>1/3</w:t>
+            </w:r>
+          </w:p>
+        </w:tc>
+        <w:tc>
+          <w:tcPr>
+            <w:tcW w:type="dxa" w:w="1234"/>
+          </w:tcPr>
+          <w:p>
+            <w:r>
+              <w:t>1/4</w:t>
+            </w:r>
+          </w:p>
+        </w:tc>
+        <w:tc>
+          <w:tcPr>
+            <w:tcW w:type="dxa" w:w="1234"/>
+          </w:tcPr>
+          <w:p>
+            <w:r>
+              <w:t>2/5</w:t>
+            </w:r>
+          </w:p>
+        </w:tc>
+        <w:tc>
+          <w:tcPr>
+            <w:tcW w:type="dxa" w:w="1234"/>
+          </w:tcPr>
+          <w:p>
+            <w:r/>
+          </w:p>
+        </w:tc>
+      </w:tr>
+    </w:tbl>
+    <w:p/>
+    <w:p>
+      <w:pPr>
+        <w:pStyle w:val="ListBullet"/>
+      </w:pPr>
+      <w:r>
+        <w:t>Recall@1 = 0 (ilk sonuç yanlış), Recall@5 = 1 (5 içinde doğru var), Recall@20 = 1.</w:t>
       </w:r>
     </w:p>
     <w:p>
@@ -376,7 +1004,37 @@
         <w:pStyle w:val="ListBullet"/>
       </w:pPr>
       <w:r>
-        <w:t>Google Colab'da L4 GPU ile 4 model × 2 ayrım (val_internal, test) için toplam ≈ 300 bin görüntü işlendi; hız modeline göre 65–932 görüntü/sn, toplam ≈ 9 dakika.</w:t>
+        <w:t>AP = (1/2 + 2/5) / 2 = 0,45. İkinci doğru 50. sırada olsaydı AP = (1/2 + 2/50)/2 = 0,27: mAP geç bulunan doğruları cezalandırır, Recall@K cezalandırmaz.</w:t>
+      </w:r>
+    </w:p>
+    <w:p>
+      <w:r>
+        <w:rPr>
+          <w:b/>
+        </w:rPr>
+        <w:t>Kategori tutarlılığı@5</w:t>
+      </w:r>
+      <w:r>
+        <w:t xml:space="preserve"> — ilk 5 sonucun sorguyla aynı kategoride (tişört, etek…) olma oranı. Hoca görüşmesinde (16 Ekim) istenen 'aynısı yoksa benzerini öner' senaryosunun ölçüsü: sistem doğru ürünü bulamasa bile aynı türden bir şey mi öneriyor?</w:t>
+      </w:r>
+    </w:p>
+    <w:p>
+      <w:r>
+        <w:rPr>
+          <w:b/>
+        </w:rPr>
+        <w:t>Boyut, ms/sorgu, indeks MB</w:t>
+      </w:r>
+      <w:r>
+        <w:t xml:space="preserve"> — verimlilik: vektör uzunluğu, sorgu başına arama süresi, kataloğun bellekte kapladığı yer (vektör sayısı × boyut × 4 bayt).</w:t>
+      </w:r>
+    </w:p>
+    <w:p>
+      <w:pPr>
+        <w:pStyle w:val="Heading1"/>
+      </w:pPr>
+      <w:r>
+        <w:t>5. Ne yapıldı?</w:t>
       </w:r>
     </w:p>
     <w:p>
@@ -384,7 +1042,7 @@
         <w:pStyle w:val="ListBullet"/>
       </w:pPr>
       <w:r>
-        <w:t>Vektörler Drive'a yazıldı, yerelde FAISS IndexFlatIP ile (yaklaşık değil, tam arama) her sorgu için en iyi 100 sonuç alındı.</w:t>
+        <w:t>crops.zip Google Drive'a yüklendi; Colab'da L4 GPU ile açıldı (339 s).</w:t>
       </w:r>
     </w:p>
     <w:p>
@@ -392,7 +1050,7 @@
         <w:pStyle w:val="ListBullet"/>
       </w:pPr>
       <w:r>
-        <w:t>Eşleşme kuralı: aynı pair_id ve aynı style. Kategori aynı ama ürün farklıysa yanlış sayıldı.</w:t>
+        <w:t>Dört model × iki ayrım (val_internal, test) × üç liste (galeri, sorgu, açık küme): toplam ≈ 300 bin kırpıntı vektöre çevrildi. Hız modele göre 65–932 görüntü/sn; toplam ≈ 9 dakika; GPU belleği &lt; 1 GB.</w:t>
       </w:r>
     </w:p>
     <w:p>
@@ -400,15 +1058,7 @@
         <w:pStyle w:val="ListBullet"/>
       </w:pPr>
       <w:r>
-        <w:t>Ek metrik (hoca görüşmesi, 16 Ekim): ilk 5 sonucun sorguyla aynı kategoride olma oranı — 'aynısı yoksa benzerini öner' senaryosu.</w:t>
-      </w:r>
-    </w:p>
-    <w:p>
-      <w:pPr>
-        <w:pStyle w:val="Heading2"/>
-      </w:pPr>
-      <w:r>
-        <w:t>4.1 Yol boyunca düzeltilen iki şey</w:t>
+        <w:t>Her liste için vektörler .npy (ham sayı dizisi) dosyasına, satır sırası listeyle aynı olacak şekilde yazıldı; sıra uyumu kodda doğrulanıyor. Drive'a ve yerel diske kopyalandı.</w:t>
       </w:r>
     </w:p>
     <w:p>
@@ -416,15 +1066,7 @@
         <w:pStyle w:val="ListBullet"/>
       </w:pPr>
       <w:r>
-        <w:t>CLIP: OpenAI ağırlıkları 'QuickGELU' adlı bir aktivasyonla eğitilmiş; ilk çalıştırmada standart GELU kullanılmıştı. Düzeltilip CLIP vektörleri yeniden çıkarıldı.</w:t>
-      </w:r>
-    </w:p>
-    <w:p>
-      <w:pPr>
-        <w:pStyle w:val="ListBullet"/>
-      </w:pPr>
-      <w:r>
-        <w:t>Ön işleme: Kırpıntılar dikey olduğu için (yükseklik/genişlik medyanı 1,3) 'ortadan kes' adımının yaka/etek ucunu attığından şüphelenildi; tüm modelleri 224×224'e sığdırma denendi. Kazanç olmadı (ResNet kötüleşti), bu yüzden her model kendi resmi ön işlemesiyle bırakıldı. DINOv2 için 448 px, farklı havuzlama ve kenar doldurma da denendi; sonuç değişmedi.</w:t>
+        <w:t>Değerlendirme yerel bilgisayarda CPU ile: FAISS tam arama, ilk 100 sonuç, metrikler. Her çalıştırma outputs/results/&lt;run_id&gt;/ altına ayarları, git sürümünü ve metrics.json'u yazar.</w:t>
       </w:r>
     </w:p>
     <w:p>
@@ -432,12 +1074,7 @@
         <w:pStyle w:val="Heading1"/>
       </w:pPr>
       <w:r>
-        <w:t>5. Sonuçlar (Tablo 2 — test ayrımı)</w:t>
-      </w:r>
-    </w:p>
-    <w:p>
-      <w:r>
-        <w:t>Recall@K: ilk K sonuçta en az bir doğru ürün bulunan sorguların oranı. mAP: doğru ürünlerin sıralamadaki yerini bir bütün olarak ölçer. Kat. tut.@5: ilk 5 sonucun sorguyla aynı kategoride olma oranı.</w:t>
+        <w:t>6. Sonuçlar — Tablo 1</w:t>
       </w:r>
     </w:p>
     <w:p>
@@ -445,7 +1082,7 @@
         <w:rPr>
           <w:b/>
         </w:rPr>
-        <w:t>Tablo 2. Eğitimsiz omurga karşılaştırması — test (12.375 sorgu, 36.958 galeri)</w:t>
+        <w:t>Tablo 3 (= makaledeki Tablo 1). Test ayrımı: 12.375 sorgu, 36.958 galeri</w:t>
       </w:r>
     </w:p>
     <w:tbl>
@@ -681,7 +1318,7 @@
           </w:tcPr>
           <w:p>
             <w:r>
-              <w:t>0,208</w:t>
+              <w:t>0,303</w:t>
             </w:r>
           </w:p>
         </w:tc>
@@ -773,7 +1410,7 @@
           </w:tcPr>
           <w:p>
             <w:r>
-              <w:t>0,594</w:t>
+              <w:t>0,730</w:t>
             </w:r>
           </w:p>
         </w:tc>
@@ -865,7 +1502,7 @@
           </w:tcPr>
           <w:p>
             <w:r>
-              <w:t>0,159</w:t>
+              <w:t>0,245</w:t>
             </w:r>
           </w:p>
         </w:tc>
@@ -957,7 +1594,7 @@
           </w:tcPr>
           <w:p>
             <w:r>
-              <w:t>0,210</w:t>
+              <w:t>0,215</w:t>
             </w:r>
           </w:p>
         </w:tc>
@@ -972,7 +1609,7 @@
         <w:drawing>
           <wp:inline xmlns:a="http://schemas.openxmlformats.org/drawingml/2006/main" xmlns:pic="http://schemas.openxmlformats.org/drawingml/2006/picture">
             <wp:extent cx="5486400" cy="3771599"/>
-            <wp:docPr id="2" name="Picture 2"/>
+            <wp:docPr id="3" name="Picture 3"/>
             <wp:cNvGraphicFramePr>
               <a:graphicFrameLocks noChangeAspect="1"/>
             </wp:cNvGraphicFramePr>
@@ -984,7 +1621,7 @@
                     <pic:cNvPicPr/>
                   </pic:nvPicPr>
                   <pic:blipFill>
-                    <a:blip r:embed="rId10"/>
+                    <a:blip r:embed="rId11"/>
                     <a:stretch>
                       <a:fillRect/>
                     </a:stretch>
@@ -1013,7 +1650,7 @@
           <w:color w:val="52514E"/>
           <w:sz w:val="18"/>
         </w:rPr>
-        <w:t>Şekil 2. Dört modelin Recall@1/5/20 değerleri. SigLIP açık ara önde.</w:t>
+        <w:t>Şekil 3. Recall@1/5/20. SigLIP her K'da diğerlerinin 3–5 katı.</w:t>
       </w:r>
     </w:p>
     <w:p>
@@ -1021,7 +1658,7 @@
         <w:rPr>
           <w:b/>
         </w:rPr>
-        <w:t>Tablo 3. Aynı karşılaştırma — val_internal (6.236 sorgu, 14.533 galeri)</w:t>
+        <w:t>Tablo 4. Aynı karşılaştırma val_internal'da (6.236 sorgu, 14.533 galeri)</w:t>
       </w:r>
     </w:p>
     <w:tbl>
@@ -1377,11 +2014,7 @@
     <w:p/>
     <w:p>
       <w:r>
-        <w:rPr>
-          <w:i/>
-          <w:color w:val="404040"/>
-        </w:rPr>
-        <w:t>val_internal sayıları test'ten biraz yüksek; galeri daha küçük (14,5 bin vs 37 bin) ve style=0 dikkat dağıtıcıları içermiyor. Sıralama her iki ayrımda aynı; bu, sonucun tesadüf olmadığını gösterir.</w:t>
+        <w:t>val_internal sayıları test'ten yüksek: galeri 2,5 kat küçük ve test galerisindeki 13 bin style = 0 dikkat dağıtıcısını içermiyor. Önemli olan sıralamanın iki ayrımda da aynı olması; sonuç tek bir veri kümesine özgü değil.</w:t>
       </w:r>
     </w:p>
     <w:p>
@@ -1389,12 +2022,12 @@
         <w:pStyle w:val="Heading2"/>
       </w:pPr>
       <w:r>
-        <w:t>5.1 DeepFashion2 makalesiyle karşılaştırma</w:t>
+        <w:t>6.1 Makaledeki eğitimli yöntemle karşılaştırma</w:t>
       </w:r>
     </w:p>
     <w:p>
       <w:r>
-        <w:t>DeepFashion2 makalesi (Ge vd., CVPR 2019, Tablo 5) Match R-CNN için gerçek kutuyla top-1 0,268, top-10 0,574, top-20 0,665 bildirir (en iyi satır: poz + sınıf öznitelikleri; tespit edilen kutuyla 0,244 / 0,522 / 0,617). Top-5 makalede yalnızca grafikte verilir. Match R-CNN bu veri üzerinde eğitilmiş bir modeldir; bizim sayılarımız hiç eğitilmemiş modellerden gelir. Kurulum farkları: makale 'her sorgunun galeride 5'ten fazla eşi olan' bir alt küme kullanır; biz resmi val listelerini olduğu gibi kullandık ve kenarı 32 px'ten küçük 5 kaydı attık.</w:t>
+        <w:t>DeepFashion2 makalesi (Tablo 5) kendi yöntemi Match R-CNN için şu sayıları verir (gerçek kutuyla): top-1 0,268, top-10 0,574, top-20 0,665. Match R-CNN, bu veri setinin 191 bin eğitim fotoğrafıyla eğitilmiş, kıyafeti tespit edip vektör çıkaran özel bir ağdır. Top-5 makalede yalnızca grafikte var. Kurulum farkı: makale yalnızca 'galeride 5'ten fazla eşi olan' sorguları kullanır; biz resmi listeyi olduğu gibi kullandık.</w:t>
       </w:r>
     </w:p>
     <w:p>
@@ -1402,7 +2035,7 @@
         <w:rPr>
           <w:b/>
         </w:rPr>
-        <w:t>Tablo 4. Makaledeki eğitimli temel yöntem ile en iyi eğitimsiz omurga</w:t>
+        <w:t>Tablo 5. Eğitimli temel yöntem ile en iyi eğitimsiz omurga</w:t>
       </w:r>
     </w:p>
     <w:tbl>
@@ -1413,16 +2046,17 @@
         <w:tblLook w:firstColumn="1" w:firstRow="1" w:lastColumn="0" w:lastRow="0" w:noHBand="0" w:noVBand="1" w:val="04A0"/>
       </w:tblPr>
       <w:tblGrid>
-        <w:gridCol w:w="1728"/>
-        <w:gridCol w:w="1728"/>
-        <w:gridCol w:w="1728"/>
-        <w:gridCol w:w="1728"/>
-        <w:gridCol w:w="1728"/>
+        <w:gridCol w:w="1440"/>
+        <w:gridCol w:w="1440"/>
+        <w:gridCol w:w="1440"/>
+        <w:gridCol w:w="1440"/>
+        <w:gridCol w:w="1440"/>
+        <w:gridCol w:w="1440"/>
       </w:tblGrid>
       <w:tr>
         <w:tc>
           <w:tcPr>
-            <w:tcW w:type="dxa" w:w="1728"/>
+            <w:tcW w:type="dxa" w:w="1440"/>
             <w:shd w:val="clear" w:color="auto" w:fill="D9E2F3"/>
           </w:tcPr>
           <w:p>
@@ -1436,7 +2070,21 @@
         </w:tc>
         <w:tc>
           <w:tcPr>
-            <w:tcW w:type="dxa" w:w="1728"/>
+            <w:tcW w:type="dxa" w:w="1440"/>
+            <w:shd w:val="clear" w:color="auto" w:fill="D9E2F3"/>
+          </w:tcPr>
+          <w:p>
+            <w:r>
+              <w:rPr>
+                <w:b/>
+              </w:rPr>
+              <w:t>Eğitim</w:t>
+            </w:r>
+          </w:p>
+        </w:tc>
+        <w:tc>
+          <w:tcPr>
+            <w:tcW w:type="dxa" w:w="1440"/>
             <w:shd w:val="clear" w:color="auto" w:fill="D9E2F3"/>
           </w:tcPr>
           <w:p>
@@ -1450,7 +2098,7 @@
         </w:tc>
         <w:tc>
           <w:tcPr>
-            <w:tcW w:type="dxa" w:w="1728"/>
+            <w:tcW w:type="dxa" w:w="1440"/>
             <w:shd w:val="clear" w:color="auto" w:fill="D9E2F3"/>
           </w:tcPr>
           <w:p>
@@ -1464,7 +2112,7 @@
         </w:tc>
         <w:tc>
           <w:tcPr>
-            <w:tcW w:type="dxa" w:w="1728"/>
+            <w:tcW w:type="dxa" w:w="1440"/>
             <w:shd w:val="clear" w:color="auto" w:fill="D9E2F3"/>
           </w:tcPr>
           <w:p>
@@ -1478,7 +2126,7 @@
         </w:tc>
         <w:tc>
           <w:tcPr>
-            <w:tcW w:type="dxa" w:w="1728"/>
+            <w:tcW w:type="dxa" w:w="1440"/>
             <w:shd w:val="clear" w:color="auto" w:fill="D9E2F3"/>
           </w:tcPr>
           <w:p>
@@ -1494,17 +2142,27 @@
       <w:tr>
         <w:tc>
           <w:tcPr>
-            <w:tcW w:type="dxa" w:w="1728"/>
+            <w:tcW w:type="dxa" w:w="1440"/>
           </w:tcPr>
           <w:p>
             <w:r>
-              <w:t>Match R-CNN (Ge vd., 2019)</w:t>
+              <w:t>Match R-CNN (Ge vd., 2019), GT kutu</w:t>
             </w:r>
           </w:p>
         </w:tc>
         <w:tc>
           <w:tcPr>
-            <w:tcW w:type="dxa" w:w="1728"/>
+            <w:tcW w:type="dxa" w:w="1440"/>
+          </w:tcPr>
+          <w:p>
+            <w:r>
+              <w:t>DeepFashion2 ile eğitilmiş</w:t>
+            </w:r>
+          </w:p>
+        </w:tc>
+        <w:tc>
+          <w:tcPr>
+            <w:tcW w:type="dxa" w:w="1440"/>
           </w:tcPr>
           <w:p>
             <w:r>
@@ -1514,7 +2172,7 @@
         </w:tc>
         <w:tc>
           <w:tcPr>
-            <w:tcW w:type="dxa" w:w="1728"/>
+            <w:tcW w:type="dxa" w:w="1440"/>
           </w:tcPr>
           <w:p>
             <w:r>
@@ -1524,7 +2182,7 @@
         </w:tc>
         <w:tc>
           <w:tcPr>
-            <w:tcW w:type="dxa" w:w="1728"/>
+            <w:tcW w:type="dxa" w:w="1440"/>
           </w:tcPr>
           <w:p>
             <w:r>
@@ -1534,7 +2192,7 @@
         </w:tc>
         <w:tc>
           <w:tcPr>
-            <w:tcW w:type="dxa" w:w="1728"/>
+            <w:tcW w:type="dxa" w:w="1440"/>
           </w:tcPr>
           <w:p>
             <w:r>
@@ -1546,17 +2204,89 @@
       <w:tr>
         <w:tc>
           <w:tcPr>
-            <w:tcW w:type="dxa" w:w="1728"/>
+            <w:tcW w:type="dxa" w:w="1440"/>
           </w:tcPr>
           <w:p>
             <w:r>
-              <w:t>SigLIP ViT-B/16 (eğitimsiz, bu proje)</w:t>
+              <w:t>Match R-CNN, tespit edilen kutu</w:t>
             </w:r>
           </w:p>
         </w:tc>
         <w:tc>
           <w:tcPr>
-            <w:tcW w:type="dxa" w:w="1728"/>
+            <w:tcW w:type="dxa" w:w="1440"/>
+          </w:tcPr>
+          <w:p>
+            <w:r>
+              <w:t>DeepFashion2 ile eğitilmiş</w:t>
+            </w:r>
+          </w:p>
+        </w:tc>
+        <w:tc>
+          <w:tcPr>
+            <w:tcW w:type="dxa" w:w="1440"/>
+          </w:tcPr>
+          <w:p>
+            <w:r>
+              <w:t>0,244</w:t>
+            </w:r>
+          </w:p>
+        </w:tc>
+        <w:tc>
+          <w:tcPr>
+            <w:tcW w:type="dxa" w:w="1440"/>
+          </w:tcPr>
+          <w:p>
+            <w:r>
+              <w:t>—</w:t>
+            </w:r>
+          </w:p>
+        </w:tc>
+        <w:tc>
+          <w:tcPr>
+            <w:tcW w:type="dxa" w:w="1440"/>
+          </w:tcPr>
+          <w:p>
+            <w:r>
+              <w:t>0,522</w:t>
+            </w:r>
+          </w:p>
+        </w:tc>
+        <w:tc>
+          <w:tcPr>
+            <w:tcW w:type="dxa" w:w="1440"/>
+          </w:tcPr>
+          <w:p>
+            <w:r>
+              <w:t>0,617</w:t>
+            </w:r>
+          </w:p>
+        </w:tc>
+      </w:tr>
+      <w:tr>
+        <w:tc>
+          <w:tcPr>
+            <w:tcW w:type="dxa" w:w="1440"/>
+          </w:tcPr>
+          <w:p>
+            <w:r>
+              <w:t>SigLIP ViT-B/16 (bu proje)</w:t>
+            </w:r>
+          </w:p>
+        </w:tc>
+        <w:tc>
+          <w:tcPr>
+            <w:tcW w:type="dxa" w:w="1440"/>
+          </w:tcPr>
+          <w:p>
+            <w:r>
+              <w:t>hiç</w:t>
+            </w:r>
+          </w:p>
+        </w:tc>
+        <w:tc>
+          <w:tcPr>
+            <w:tcW w:type="dxa" w:w="1440"/>
           </w:tcPr>
           <w:p>
             <w:r>
@@ -1566,7 +2296,7 @@
         </w:tc>
         <w:tc>
           <w:tcPr>
-            <w:tcW w:type="dxa" w:w="1728"/>
+            <w:tcW w:type="dxa" w:w="1440"/>
           </w:tcPr>
           <w:p>
             <w:r>
@@ -1576,7 +2306,7 @@
         </w:tc>
         <w:tc>
           <w:tcPr>
-            <w:tcW w:type="dxa" w:w="1728"/>
+            <w:tcW w:type="dxa" w:w="1440"/>
           </w:tcPr>
           <w:p>
             <w:r>
@@ -1586,7 +2316,7 @@
         </w:tc>
         <w:tc>
           <w:tcPr>
-            <w:tcW w:type="dxa" w:w="1728"/>
+            <w:tcW w:type="dxa" w:w="1440"/>
           </w:tcPr>
           <w:p>
             <w:r>
@@ -1598,11 +2328,16 @@
     </w:tbl>
     <w:p/>
     <w:p>
+      <w:r>
+        <w:t>Hiç eğitilmemiş SigLIP, bu veri için eğitilmiş Match R-CNN'i top-1'de 9 puan geçiyor. 2019'dan bu yana büyük veriyle eğitilmiş genel amaçlı modellerin gücü budur.</w:t>
+      </w:r>
+    </w:p>
+    <w:p>
       <w:pPr>
         <w:pStyle w:val="Heading1"/>
       </w:pPr>
       <w:r>
-        <w:t>6. Sonuçları nasıl okumalı?</w:t>
+        <w:t>7. Yorum</w:t>
       </w:r>
     </w:p>
     <w:p>
@@ -1610,7 +2345,7 @@
         <w:pStyle w:val="ListBullet"/>
       </w:pPr>
       <w:r>
-        <w:t>SigLIP ViT-B/16 en iyi: her 100 müşteri fotoğrafından 36'inde ilk sonuç doğru ürün, 55'inde doğru ürün ilk 5'te. Hiç eğitilmeden.</w:t>
+        <w:t>SigLIP: her 100 sorgudan 36'inde ilk sonuç doğru ürün, 55'inde doğru ürün ilk 5'te. Metinle eşleşme hedefi, modeli 'bu görüntüde hangi nesne var' sorusuna odaklar; arka plan, ışık, poz vektöre az girer.</w:t>
       </w:r>
     </w:p>
     <w:p>
@@ -1618,7 +2353,7 @@
         <w:pStyle w:val="ListBullet"/>
       </w:pPr>
       <w:r>
-        <w:t>ResNet-50, CLIP ve DINOv2 çok geride (R@1 %9–%6). DINOv2'nin genel amaçlı görsel özelliklerde çok iyi olmasına rağmen burada zayıf kalması dikkat çekici: müşteri fotoğrafındaki ayna, oda, poz gibi 'bağlam' DINOv2 vektörüne giriyor; SigLIP ise metinle eşleşme öğrendiği için nesnenin kendisine odaklanıyor.</w:t>
+        <w:t>CLIP aynı fikirle eğitilmiş ama çok geride (0.079). Fark: daha küçük/kirli veri, softmax kaybı, 512'ye sıkıştırılmış vektör ve ortadan kesme.</w:t>
       </w:r>
     </w:p>
     <w:p>
@@ -1626,7 +2361,7 @@
         <w:pStyle w:val="ListBullet"/>
       </w:pPr>
       <w:r>
-        <w:t>Kategori tutarlılığı da SigLIP'te en yüksek (%68): aynısını bulamadığında bile benzer türden ürün öneriyor.</w:t>
+        <w:t>DINOv2 (0.065): genel görsel özelliklerde çok iyi bilinen bu modelin burada zayıf kalması dikkat çekici. Kendi kendine öğrenme 'aynı fotoğrafın parçaları' üzerinden yapıldığı için vektör, fotoğrafın bütününü (ayna, oda, vücut pozu) temsil eder; müşteri ve mağaza fotoğrafları arasındaki ortam farkını aşamaz. Yukarıda anlatılan çözünürlük/havuzlama denemeleri bunun bir ayar hatası olmadığını gösteriyor.</w:t>
       </w:r>
     </w:p>
     <w:p>
@@ -1634,7 +2369,7 @@
         <w:pStyle w:val="ListBullet"/>
       </w:pPr>
       <w:r>
-        <w:t>Vektör boyutu ile başarı arasında ilişki yok: ResNet'in 2048 boyutlu vektörü 512 boyutlu CLIP'ten biraz iyi, 768 boyutlu SigLIP'ten çok kötü.</w:t>
+        <w:t>ResNet-50 (0.088): ImageNet sınıfları (köpek, araba…) kıyafet varyantlarını ayırmak için eğitilmemiş; 2048 boyutlu vektör bile yardım etmiyor.</w:t>
       </w:r>
     </w:p>
     <w:p>
@@ -1642,7 +2377,7 @@
         <w:pStyle w:val="ListBullet"/>
       </w:pPr>
       <w:r>
-        <w:t>Arama hızı: 37 bin ürünlük katalogda sorgu başına 1 ms'nin altında (CPU). Ölçek sorun değil.</w:t>
+        <w:t>Kategori tutarlılığı da SigLIP'te en yüksek (%68): doğru ürünü bulamadığında bile çoğunlukla aynı türden ürün getiriyor.</w:t>
       </w:r>
     </w:p>
     <w:p>
@@ -1650,7 +2385,7 @@
         <w:pStyle w:val="Heading1"/>
       </w:pPr>
       <w:r>
-        <w:t>7. Örnekler</w:t>
+        <w:t>8. Örnekler</w:t>
       </w:r>
     </w:p>
     <w:p>
@@ -1661,7 +2396,7 @@
         <w:drawing>
           <wp:inline xmlns:a="http://schemas.openxmlformats.org/drawingml/2006/main" xmlns:pic="http://schemas.openxmlformats.org/drawingml/2006/picture">
             <wp:extent cx="5760720" cy="3539673"/>
-            <wp:docPr id="3" name="Picture 3"/>
+            <wp:docPr id="4" name="Picture 4"/>
             <wp:cNvGraphicFramePr>
               <a:graphicFrameLocks noChangeAspect="1"/>
             </wp:cNvGraphicFramePr>
@@ -1673,7 +2408,7 @@
                     <pic:cNvPicPr/>
                   </pic:nvPicPr>
                   <pic:blipFill>
-                    <a:blip r:embed="rId11"/>
+                    <a:blip r:embed="rId12"/>
                     <a:stretch>
                       <a:fillRect/>
                     </a:stretch>
@@ -1702,7 +2437,7 @@
           <w:color w:val="52514E"/>
           <w:sz w:val="18"/>
         </w:rPr>
-        <w:t>Şekil 3. Başarılı sorgular: solda müşteri fotoğrafı, sağda en benzer 5 katalog görüntüsü; yeşil çerçeve = doğru ürün.</w:t>
+        <w:t>Şekil 4. Doğru bulunan sorgular. Her satırda solda müşteri kırpıntısı, sağda en benzer 5 katalog kırpıntısı ve kosinüs skorları; yeşil çerçeve = aynı ürün. Baskılı tişört ve belirgin desenli etekler kolay.</w:t>
       </w:r>
     </w:p>
     <w:p>
@@ -1713,7 +2448,7 @@
         <w:drawing>
           <wp:inline xmlns:a="http://schemas.openxmlformats.org/drawingml/2006/main" xmlns:pic="http://schemas.openxmlformats.org/drawingml/2006/picture">
             <wp:extent cx="5760720" cy="2341630"/>
-            <wp:docPr id="4" name="Picture 4"/>
+            <wp:docPr id="5" name="Picture 5"/>
             <wp:cNvGraphicFramePr>
               <a:graphicFrameLocks noChangeAspect="1"/>
             </wp:cNvGraphicFramePr>
@@ -1725,7 +2460,7 @@
                     <pic:cNvPicPr/>
                   </pic:nvPicPr>
                   <pic:blipFill>
-                    <a:blip r:embed="rId12"/>
+                    <a:blip r:embed="rId13"/>
                     <a:stretch>
                       <a:fillRect/>
                     </a:stretch>
@@ -1754,7 +2489,7 @@
           <w:color w:val="52514E"/>
           <w:sz w:val="18"/>
         </w:rPr>
-        <w:t>Şekil 4. Başarısız sorgular: doğru ürün ilk 5'te yok. Tipik nedenler: düşük ışık, kapanma, çok benzer varyantlar.</w:t>
+        <w:t>Şekil 5. Doğru ürünü ilk 5'e koyamadığı sorgular. Getirilenler 'yanlış' ama görsel olarak çok benzer (aynı desen, aynı kesim): model tür/desen benzerliği öğrenmiş, ürün kimliği değil.</w:t>
       </w:r>
     </w:p>
     <w:p>
@@ -1762,7 +2497,7 @@
         <w:pStyle w:val="Heading1"/>
       </w:pPr>
       <w:r>
-        <w:t>8. Karar ve sıradaki adım</w:t>
+        <w:t>9. Karar ve sıradaki adım</w:t>
       </w:r>
     </w:p>
     <w:p>
@@ -1770,7 +2505,7 @@
         <w:pStyle w:val="ListBullet"/>
       </w:pPr>
       <w:r>
-        <w:t>Devam eden tüm adımlar (açık küme analizi, projeksiyon başlığı eğitimi) SigLIP ViT-B/16 üzerinde yapılacak.</w:t>
+        <w:t>Bundan sonraki adımlar SigLIP ViT-B/16 vektörleri üzerinde yapılacak.</w:t>
       </w:r>
     </w:p>
     <w:p>
@@ -1778,7 +2513,7 @@
         <w:pStyle w:val="ListBullet"/>
       </w:pPr>
       <w:r>
-        <w:t>Adım 3: 'katalogda yok' kararı (mutlak eşik vs. margin, AUROC, kapsama–kesinlik eğrisi) ve occlusion/scale/zoom/viewpoint/kategori kırılımları.</w:t>
+        <w:t>Adım 3: 'katalogda yok' kararı ve başarının çekim koşullarına göre kırılımı — GPU gerekmez, bu adımın vektörleri yeter.</w:t>
       </w:r>
     </w:p>
     <w:p>
@@ -1786,7 +2521,7 @@
         <w:pStyle w:val="ListBullet"/>
       </w:pPr>
       <w:r>
-        <w:t>Adım 4: SigLIP vektörleri üzerinde küçük bir projeksiyon başlığı eğitimi (InfoNCE) — Araştırma Sorusu 2.</w:t>
+        <w:t>Adım 4: SigLIP vektörlerinin üstüne küçük bir öğrenilmiş katman (projeksiyon başlığı) ekleyip DeepFashion2'nin kendi eğitim verisiyle eğitmek. Hedef, 'benzer ama farklı' ürünleri ayırmayı öğretmek (Şekil 5'teki hata türü).</w:t>
       </w:r>
     </w:p>
     <w:p>
@@ -1794,7 +2529,7 @@
         <w:pStyle w:val="Heading1"/>
       </w:pPr>
       <w:r>
-        <w:t>9. Ortaya çıkan dosyalar</w:t>
+        <w:t>10. Dosyalar</w:t>
       </w:r>
     </w:p>
     <w:p>
@@ -1810,7 +2545,7 @@
         <w:pStyle w:val="ListBullet"/>
       </w:pPr>
       <w:r>
-        <w:t>outputs/results/&lt;run_id&gt;/{metrics.json, per_query.parquet, config.yaml, git_hash.txt} — 8 çalıştırma</w:t>
+        <w:t>outputs/results/&lt;run_id&gt;/metrics.json, per_query.parquet — 8 çalıştırma</w:t>
       </w:r>
     </w:p>
     <w:p>
@@ -1818,7 +2553,7 @@
         <w:pStyle w:val="ListBullet"/>
       </w:pPr>
       <w:r>
-        <w:t>reports/tables/table1_backbones_{test,val_internal}.csv, table1_backbones.tex, all_runs.csv</w:t>
+        <w:t>reports/tables/table1_backbones_{test,val_internal}.csv, table1_backbones.tex; docs/EXPERIMENTS.md</w:t>
       </w:r>
     </w:p>
     <w:p>
@@ -1826,7 +2561,7 @@
         <w:pStyle w:val="ListBullet"/>
       </w:pPr>
       <w:r>
-        <w:t>docs/EXPERIMENTS.md — deney kaydı</w:t>
+        <w:t>src/fashret/models/ (dört sarmalayıcı), engine/extractor.py, evaluation/closed_set.py; tests/test_closed_set.py (elle hesaplanmış örnekler)</w:t>
       </w:r>
     </w:p>
     <w:sectPr>

</xml_diff>